<commit_message>
docs: completar plazo de entrega y estado al cierre en el anexo II
</commit_message>
<xml_diff>
--- a/output/2026-08/Anexo-II-Informe-mensual-horas-KLG-2026-08 (1).docx
+++ b/output/2026-08/Anexo-II-Informe-mensual-horas-KLG-2026-08 (1).docx
@@ -229,7 +229,7 @@
                 <w:sz w:val="18"/>
                 <w:szCs w:val="18"/>
               </w:rPr>
-              <w:t xml:space="preserve">Se entrega dentro de los primeros [●] días hábiles del mes siguiente.</w:t>
+              <w:t>Se entrega dentro de los primeros 5 días hábiles del mes siguiente.</w:t>
             </w:r>
           </w:p>
         </w:tc>
@@ -3017,7 +3017,7 @@
                 <w:sz w:val="19"/>
                 <w:szCs w:val="19"/>
               </w:rPr>
-              <w:t>[●]</w:t>
+              <w:t>Terminado</w:t>
             </w:r>
           </w:p>
         </w:tc>
@@ -3178,7 +3178,7 @@
                 <w:sz w:val="19"/>
                 <w:szCs w:val="19"/>
               </w:rPr>
-              <w:t>[●]</w:t>
+              <w:t>Terminado</w:t>
             </w:r>
           </w:p>
         </w:tc>
@@ -3339,7 +3339,7 @@
                 <w:sz w:val="19"/>
                 <w:szCs w:val="19"/>
               </w:rPr>
-              <w:t>[●]</w:t>
+              <w:t>Terminado</w:t>
             </w:r>
           </w:p>
         </w:tc>
@@ -3500,7 +3500,7 @@
                 <w:sz w:val="19"/>
                 <w:szCs w:val="19"/>
               </w:rPr>
-              <w:t>[●]</w:t>
+              <w:t>Terminado</w:t>
             </w:r>
           </w:p>
         </w:tc>
@@ -3661,7 +3661,7 @@
                 <w:sz w:val="19"/>
                 <w:szCs w:val="19"/>
               </w:rPr>
-              <w:t>[●]</w:t>
+              <w:t>Terminado</w:t>
             </w:r>
           </w:p>
         </w:tc>
@@ -3819,7 +3819,7 @@
                 <w:sz w:val="19"/>
                 <w:szCs w:val="19"/>
               </w:rPr>
-              <w:t xml:space="preserve">[●]</w:t>
+              <w:t>Terminado</w:t>
             </w:r>
           </w:p>
         </w:tc>
@@ -3977,7 +3977,7 @@
                 <w:sz w:val="19"/>
                 <w:szCs w:val="19"/>
               </w:rPr>
-              <w:t xml:space="preserve">[●]</w:t>
+              <w:t>Terminado</w:t>
             </w:r>
           </w:p>
         </w:tc>
@@ -4135,7 +4135,7 @@
                 <w:sz w:val="19"/>
                 <w:szCs w:val="19"/>
               </w:rPr>
-              <w:t xml:space="preserve">[●]</w:t>
+              <w:t>Terminado</w:t>
             </w:r>
           </w:p>
         </w:tc>
@@ -4293,7 +4293,7 @@
                 <w:sz w:val="19"/>
                 <w:szCs w:val="19"/>
               </w:rPr>
-              <w:t xml:space="preserve">[●]</w:t>
+              <w:t>Terminado</w:t>
             </w:r>
           </w:p>
         </w:tc>
@@ -4451,7 +4451,7 @@
                 <w:sz w:val="19"/>
                 <w:szCs w:val="19"/>
               </w:rPr>
-              <w:t xml:space="preserve">[●]</w:t>
+              <w:t>Terminado</w:t>
             </w:r>
           </w:p>
         </w:tc>
@@ -4609,7 +4609,7 @@
                 <w:sz w:val="19"/>
                 <w:szCs w:val="19"/>
               </w:rPr>
-              <w:t xml:space="preserve">[●]</w:t>
+              <w:t>Terminado</w:t>
             </w:r>
           </w:p>
         </w:tc>
@@ -4767,7 +4767,7 @@
                 <w:sz w:val="19"/>
                 <w:szCs w:val="19"/>
               </w:rPr>
-              <w:t xml:space="preserve">[●]</w:t>
+              <w:t>Terminado</w:t>
             </w:r>
           </w:p>
         </w:tc>
@@ -4922,7 +4922,7 @@
                 <w:sz w:val="19"/>
                 <w:szCs w:val="19"/>
               </w:rPr>
-              <w:t xml:space="preserve">[●]</w:t>
+              <w:t>Terminado</w:t>
             </w:r>
           </w:p>
         </w:tc>
@@ -5077,7 +5077,7 @@
                 <w:sz w:val="19"/>
                 <w:szCs w:val="19"/>
               </w:rPr>
-              <w:t xml:space="preserve">[●]</w:t>
+              <w:t>Terminado</w:t>
             </w:r>
           </w:p>
         </w:tc>
@@ -5232,7 +5232,7 @@
                 <w:sz w:val="19"/>
                 <w:szCs w:val="19"/>
               </w:rPr>
-              <w:t xml:space="preserve">[●]</w:t>
+              <w:t>Terminado</w:t>
             </w:r>
           </w:p>
         </w:tc>
@@ -5390,7 +5390,7 @@
                 <w:sz w:val="19"/>
                 <w:szCs w:val="19"/>
               </w:rPr>
-              <w:t xml:space="preserve">[●]</w:t>
+              <w:t>Terminado</w:t>
             </w:r>
           </w:p>
         </w:tc>
@@ -5545,7 +5545,7 @@
                 <w:sz w:val="19"/>
                 <w:szCs w:val="19"/>
               </w:rPr>
-              <w:t xml:space="preserve">[●]</w:t>
+              <w:t>Terminado</w:t>
             </w:r>
           </w:p>
         </w:tc>
@@ -5703,7 +5703,7 @@
                 <w:sz w:val="19"/>
                 <w:szCs w:val="19"/>
               </w:rPr>
-              <w:t xml:space="preserve">[●]</w:t>
+              <w:t>Terminado</w:t>
             </w:r>
           </w:p>
         </w:tc>
@@ -5861,7 +5861,7 @@
                 <w:sz w:val="19"/>
                 <w:szCs w:val="19"/>
               </w:rPr>
-              <w:t xml:space="preserve">[●]</w:t>
+              <w:t>Terminado</w:t>
             </w:r>
           </w:p>
         </w:tc>
@@ -6019,7 +6019,7 @@
                 <w:sz w:val="19"/>
                 <w:szCs w:val="19"/>
               </w:rPr>
-              <w:t xml:space="preserve">[●]</w:t>
+              <w:t>Terminado</w:t>
             </w:r>
           </w:p>
         </w:tc>
@@ -6177,7 +6177,7 @@
                 <w:sz w:val="19"/>
                 <w:szCs w:val="19"/>
               </w:rPr>
-              <w:t xml:space="preserve">[●]</w:t>
+              <w:t>Terminado</w:t>
             </w:r>
           </w:p>
         </w:tc>

</xml_diff>

<commit_message>
docs: incorporar el detalle de horas que entrego Alexis Carnero en agosto 2026
Alexis Carnero entrego su propia planilla de agosto (Horas_Agosto_2026_Alexis_Carnero.xlsx). El script la carga como una entrada mas, junto a la de Gabriel Denis, y antes de escribir verifica que cada dia, inicio, fin y horas coincidan con el anexo ya separado.

- Detalle: las 17 filas de Alexis dejan de estar sin descripcion.
- Nota KLG de Alexis: el horario sigue siendo una reconstruccion de KLG, pero ahora consta que el detalle que entrego coincide con ella.
- Tabla 3 del informe: la linea de 59,0 h sin describir se reemplaza por cinco lineas agrupadas por tema (26,5 + 5,0 + 12,0 + 8,5 + 7,0).
- Tabla 4: la explicacion de alertas dice que el detalle esta incorporado y que coincide con la separacion de horas.

Totales sin cambios: 306,0 h y 5.415,00.
</commit_message>
<xml_diff>
--- a/output/2026-08/Anexo-II-Informe-mensual-horas-KLG-2026-08 (1).docx
+++ b/output/2026-08/Anexo-II-Informe-mensual-horas-KLG-2026-08 (1).docx
@@ -3631,7 +3631,7 @@
                 <w:sz w:val="19"/>
                 <w:szCs w:val="19"/>
               </w:rPr>
-              <w:t>Alexis Carnero: sin descripción en Kimai. KLG debe detallar el trabajo realizado.</w:t>
+              <w:t>Registros Técnicos (RRTT), Alexis Carnero: cierre del Hito 2, con el diagnóstico y la corrección del bug del Certificado de Inscripción Vigente (datos faltantes del inscrito y domicilio de casa matriz), la entrega de los componentes ASP y los scripts SQL del Req17, el despliegue de la API en desarrollo y el inventario de componentes para el traspaso a Producción</w:t>
             </w:r>
           </w:p>
         </w:tc>
@@ -3691,7 +3691,651 @@
                 <w:sz w:val="19"/>
                 <w:szCs w:val="19"/>
               </w:rPr>
-              <w:t>59,0</w:t>
+              <w:t>26,5</w:t>
+            </w:r>
+          </w:p>
+        </w:tc>
+      </w:tr>
+      <w:tr>
+        <w:trPr>
+          <w:cantSplit/>
+        </w:trPr>
+        <w:tc>
+          <w:tcPr>
+            <w:tcW w:type="dxa" w:w="1500"/>
+            <w:tcBorders>
+              <w:top w:val="single" w:color="808080" w:sz="4"/>
+              <w:left w:val="single" w:color="808080" w:sz="4"/>
+              <w:bottom w:val="single" w:color="808080" w:sz="4"/>
+              <w:right w:val="single" w:color="808080" w:sz="4"/>
+            </w:tcBorders>
+            <w:tcMar>
+              <w:top w:type="dxa" w:w="40"/>
+              <w:left w:type="dxa" w:w="90"/>
+              <w:bottom w:type="dxa" w:w="40"/>
+              <w:right w:type="dxa" w:w="90"/>
+            </w:tcMar>
+          </w:tcPr>
+          <w:p>
+            <w:pPr>
+              <w:spacing w:after="30" w:before="30"/>
+            </w:pPr>
+            <w:r>
+              <w:rPr>
+                <w:rFonts w:ascii="Arial" w:cs="Arial" w:eastAsia="Arial" w:hAnsi="Arial"/>
+                <w:sz w:val="19"/>
+                <w:szCs w:val="19"/>
+              </w:rPr>
+              <w:t>MinVu</w:t>
+            </w:r>
+          </w:p>
+        </w:tc>
+        <w:tc>
+          <w:tcPr>
+            <w:tcW w:type="dxa" w:w="1400"/>
+            <w:tcBorders>
+              <w:top w:val="single" w:color="808080" w:sz="4"/>
+              <w:left w:val="single" w:color="808080" w:sz="4"/>
+              <w:bottom w:val="single" w:color="808080" w:sz="4"/>
+              <w:right w:val="single" w:color="808080" w:sz="4"/>
+            </w:tcBorders>
+            <w:tcMar>
+              <w:top w:type="dxa" w:w="40"/>
+              <w:left w:type="dxa" w:w="90"/>
+              <w:bottom w:type="dxa" w:w="40"/>
+              <w:right w:type="dxa" w:w="90"/>
+            </w:tcMar>
+          </w:tcPr>
+          <w:p>
+            <w:pPr>
+              <w:spacing w:after="30" w:before="30"/>
+            </w:pPr>
+            <w:r>
+              <w:rPr>
+                <w:rFonts w:ascii="Arial" w:cs="Arial" w:eastAsia="Arial" w:hAnsi="Arial"/>
+                <w:b/>
+                <w:bCs/>
+                <w:color w:val="C00000"/>
+                <w:sz w:val="19"/>
+                <w:szCs w:val="19"/>
+              </w:rPr>
+              <w:t>BUG-107 · BUG-109 · BUG-110 · BUG-115</w:t>
+            </w:r>
+          </w:p>
+        </w:tc>
+        <w:tc>
+          <w:tcPr>
+            <w:tcW w:type="dxa" w:w="4238"/>
+            <w:tcBorders>
+              <w:top w:val="single" w:color="808080" w:sz="4"/>
+              <w:left w:val="single" w:color="808080" w:sz="4"/>
+              <w:bottom w:val="single" w:color="808080" w:sz="4"/>
+              <w:right w:val="single" w:color="808080" w:sz="4"/>
+            </w:tcBorders>
+            <w:tcMar>
+              <w:top w:type="dxa" w:w="40"/>
+              <w:left w:type="dxa" w:w="90"/>
+              <w:bottom w:type="dxa" w:w="40"/>
+              <w:right w:type="dxa" w:w="90"/>
+            </w:tcMar>
+          </w:tcPr>
+          <w:p>
+            <w:pPr>
+              <w:spacing w:after="30" w:before="30"/>
+            </w:pPr>
+            <w:r>
+              <w:rPr>
+                <w:rFonts w:ascii="Arial" w:cs="Arial" w:eastAsia="Arial" w:hAnsi="Arial"/>
+                <w:b/>
+                <w:bCs/>
+                <w:color w:val="C00000"/>
+                <w:sz w:val="19"/>
+                <w:szCs w:val="19"/>
+              </w:rPr>
+              <w:t>Registros Técnicos (RRTT), Alexis Carnero: corrección de los bugs de los informes, incluidos el BUG-107 (tipo de artículo 6 mal clasificado por el criterio D.S. 135 invertido), el BUG-109 y el BUG-110 de la entrega v31 y el BUG-115 (desborde de Integer en el DLL VB6 al modificar informes, reemplazado por el SP USP_UPD_INFORME_JURIDICO), más la atención del incidente del Informe Jurídico con rol SEREMI</w:t>
+            </w:r>
+          </w:p>
+        </w:tc>
+        <w:tc>
+          <w:tcPr>
+            <w:tcW w:type="dxa" w:w="1300"/>
+            <w:tcBorders>
+              <w:top w:val="single" w:color="808080" w:sz="4"/>
+              <w:left w:val="single" w:color="808080" w:sz="4"/>
+              <w:bottom w:val="single" w:color="808080" w:sz="4"/>
+              <w:right w:val="single" w:color="808080" w:sz="4"/>
+            </w:tcBorders>
+            <w:tcMar>
+              <w:top w:type="dxa" w:w="40"/>
+              <w:left w:type="dxa" w:w="90"/>
+              <w:bottom w:type="dxa" w:w="40"/>
+              <w:right w:type="dxa" w:w="90"/>
+            </w:tcMar>
+          </w:tcPr>
+          <w:p>
+            <w:pPr>
+              <w:spacing w:after="30" w:before="30"/>
+            </w:pPr>
+            <w:r>
+              <w:rPr>
+                <w:rFonts w:ascii="Arial" w:cs="Arial" w:eastAsia="Arial" w:hAnsi="Arial"/>
+                <w:sz w:val="19"/>
+                <w:szCs w:val="19"/>
+              </w:rPr>
+              <w:t>Terminado</w:t>
+            </w:r>
+          </w:p>
+        </w:tc>
+        <w:tc>
+          <w:tcPr>
+            <w:tcW w:type="dxa" w:w="1200"/>
+            <w:tcBorders>
+              <w:top w:val="single" w:color="808080" w:sz="4"/>
+              <w:left w:val="single" w:color="808080" w:sz="4"/>
+              <w:bottom w:val="single" w:color="808080" w:sz="4"/>
+              <w:right w:val="single" w:color="808080" w:sz="4"/>
+            </w:tcBorders>
+            <w:tcMar>
+              <w:top w:type="dxa" w:w="40"/>
+              <w:left w:type="dxa" w:w="90"/>
+              <w:bottom w:type="dxa" w:w="40"/>
+              <w:right w:type="dxa" w:w="90"/>
+            </w:tcMar>
+          </w:tcPr>
+          <w:p>
+            <w:pPr>
+              <w:spacing w:after="30" w:before="30"/>
+            </w:pPr>
+            <w:r>
+              <w:rPr>
+                <w:rFonts w:ascii="Arial" w:cs="Arial" w:eastAsia="Arial" w:hAnsi="Arial"/>
+                <w:sz w:val="19"/>
+                <w:szCs w:val="19"/>
+              </w:rPr>
+              <w:t>5,0</w:t>
+            </w:r>
+          </w:p>
+        </w:tc>
+      </w:tr>
+      <w:tr>
+        <w:trPr>
+          <w:cantSplit/>
+        </w:trPr>
+        <w:tc>
+          <w:tcPr>
+            <w:tcW w:type="dxa" w:w="1500"/>
+            <w:tcBorders>
+              <w:top w:val="single" w:color="808080" w:sz="4"/>
+              <w:left w:val="single" w:color="808080" w:sz="4"/>
+              <w:bottom w:val="single" w:color="808080" w:sz="4"/>
+              <w:right w:val="single" w:color="808080" w:sz="4"/>
+            </w:tcBorders>
+            <w:tcMar>
+              <w:top w:type="dxa" w:w="40"/>
+              <w:left w:type="dxa" w:w="90"/>
+              <w:bottom w:type="dxa" w:w="40"/>
+              <w:right w:type="dxa" w:w="90"/>
+            </w:tcMar>
+          </w:tcPr>
+          <w:p>
+            <w:pPr>
+              <w:spacing w:after="30" w:before="30"/>
+            </w:pPr>
+            <w:r>
+              <w:rPr>
+                <w:rFonts w:ascii="Arial" w:cs="Arial" w:eastAsia="Arial" w:hAnsi="Arial"/>
+                <w:sz w:val="19"/>
+                <w:szCs w:val="19"/>
+              </w:rPr>
+              <w:t>MinVu</w:t>
+            </w:r>
+          </w:p>
+        </w:tc>
+        <w:tc>
+          <w:tcPr>
+            <w:tcW w:type="dxa" w:w="1400"/>
+            <w:tcBorders>
+              <w:top w:val="single" w:color="808080" w:sz="4"/>
+              <w:left w:val="single" w:color="808080" w:sz="4"/>
+              <w:bottom w:val="single" w:color="808080" w:sz="4"/>
+              <w:right w:val="single" w:color="808080" w:sz="4"/>
+            </w:tcBorders>
+            <w:tcMar>
+              <w:top w:type="dxa" w:w="40"/>
+              <w:left w:type="dxa" w:w="90"/>
+              <w:bottom w:type="dxa" w:w="40"/>
+              <w:right w:type="dxa" w:w="90"/>
+            </w:tcMar>
+          </w:tcPr>
+          <w:p>
+            <w:pPr>
+              <w:spacing w:after="30" w:before="30"/>
+            </w:pPr>
+            <w:r>
+              <w:rPr>
+                <w:rFonts w:ascii="Arial" w:cs="Arial" w:eastAsia="Arial" w:hAnsi="Arial"/>
+                <w:b/>
+                <w:bCs/>
+                <w:color w:val="C00000"/>
+                <w:sz w:val="19"/>
+                <w:szCs w:val="19"/>
+              </w:rPr>
+              <w:t>Sin ticket</w:t>
+            </w:r>
+          </w:p>
+        </w:tc>
+        <w:tc>
+          <w:tcPr>
+            <w:tcW w:type="dxa" w:w="4238"/>
+            <w:tcBorders>
+              <w:top w:val="single" w:color="808080" w:sz="4"/>
+              <w:left w:val="single" w:color="808080" w:sz="4"/>
+              <w:bottom w:val="single" w:color="808080" w:sz="4"/>
+              <w:right w:val="single" w:color="808080" w:sz="4"/>
+            </w:tcBorders>
+            <w:tcMar>
+              <w:top w:type="dxa" w:w="40"/>
+              <w:left w:type="dxa" w:w="90"/>
+              <w:bottom w:type="dxa" w:w="40"/>
+              <w:right w:type="dxa" w:w="90"/>
+            </w:tcMar>
+          </w:tcPr>
+          <w:p>
+            <w:pPr>
+              <w:spacing w:after="30" w:before="30"/>
+            </w:pPr>
+            <w:r>
+              <w:rPr>
+                <w:rFonts w:ascii="Arial" w:cs="Arial" w:eastAsia="Arial" w:hAnsi="Arial"/>
+                <w:b/>
+                <w:bCs/>
+                <w:color w:val="C00000"/>
+                <w:sz w:val="19"/>
+                <w:szCs w:val="19"/>
+              </w:rPr>
+              <w:t>Registros Técnicos (RRTT), Alexis Carnero: incidentes de producción del Sprint 11, con los scripts de parametrización por decreto que dependían del Req14, el fix de mayúsculas en «Profesional Habilitante» del Certificado de Vigencia, la corrección del «ERROR EN RT», el filtro de antecedentes por decreto y el fix de atr_modifica_socio.asp</w:t>
+            </w:r>
+          </w:p>
+        </w:tc>
+        <w:tc>
+          <w:tcPr>
+            <w:tcW w:type="dxa" w:w="1300"/>
+            <w:tcBorders>
+              <w:top w:val="single" w:color="808080" w:sz="4"/>
+              <w:left w:val="single" w:color="808080" w:sz="4"/>
+              <w:bottom w:val="single" w:color="808080" w:sz="4"/>
+              <w:right w:val="single" w:color="808080" w:sz="4"/>
+            </w:tcBorders>
+            <w:tcMar>
+              <w:top w:type="dxa" w:w="40"/>
+              <w:left w:type="dxa" w:w="90"/>
+              <w:bottom w:type="dxa" w:w="40"/>
+              <w:right w:type="dxa" w:w="90"/>
+            </w:tcMar>
+          </w:tcPr>
+          <w:p>
+            <w:pPr>
+              <w:spacing w:after="30" w:before="30"/>
+            </w:pPr>
+            <w:r>
+              <w:rPr>
+                <w:rFonts w:ascii="Arial" w:cs="Arial" w:eastAsia="Arial" w:hAnsi="Arial"/>
+                <w:sz w:val="19"/>
+                <w:szCs w:val="19"/>
+              </w:rPr>
+              <w:t>Terminado</w:t>
+            </w:r>
+          </w:p>
+        </w:tc>
+        <w:tc>
+          <w:tcPr>
+            <w:tcW w:type="dxa" w:w="1200"/>
+            <w:tcBorders>
+              <w:top w:val="single" w:color="808080" w:sz="4"/>
+              <w:left w:val="single" w:color="808080" w:sz="4"/>
+              <w:bottom w:val="single" w:color="808080" w:sz="4"/>
+              <w:right w:val="single" w:color="808080" w:sz="4"/>
+            </w:tcBorders>
+            <w:tcMar>
+              <w:top w:type="dxa" w:w="40"/>
+              <w:left w:type="dxa" w:w="90"/>
+              <w:bottom w:type="dxa" w:w="40"/>
+              <w:right w:type="dxa" w:w="90"/>
+            </w:tcMar>
+          </w:tcPr>
+          <w:p>
+            <w:pPr>
+              <w:spacing w:after="30" w:before="30"/>
+            </w:pPr>
+            <w:r>
+              <w:rPr>
+                <w:rFonts w:ascii="Arial" w:cs="Arial" w:eastAsia="Arial" w:hAnsi="Arial"/>
+                <w:sz w:val="19"/>
+                <w:szCs w:val="19"/>
+              </w:rPr>
+              <w:t>12,0</w:t>
+            </w:r>
+          </w:p>
+        </w:tc>
+      </w:tr>
+      <w:tr>
+        <w:trPr>
+          <w:cantSplit/>
+        </w:trPr>
+        <w:tc>
+          <w:tcPr>
+            <w:tcW w:type="dxa" w:w="1500"/>
+            <w:tcBorders>
+              <w:top w:val="single" w:color="808080" w:sz="4"/>
+              <w:left w:val="single" w:color="808080" w:sz="4"/>
+              <w:bottom w:val="single" w:color="808080" w:sz="4"/>
+              <w:right w:val="single" w:color="808080" w:sz="4"/>
+            </w:tcBorders>
+            <w:tcMar>
+              <w:top w:type="dxa" w:w="40"/>
+              <w:left w:type="dxa" w:w="90"/>
+              <w:bottom w:type="dxa" w:w="40"/>
+              <w:right w:type="dxa" w:w="90"/>
+            </w:tcMar>
+          </w:tcPr>
+          <w:p>
+            <w:pPr>
+              <w:spacing w:after="30" w:before="30"/>
+            </w:pPr>
+            <w:r>
+              <w:rPr>
+                <w:rFonts w:ascii="Arial" w:cs="Arial" w:eastAsia="Arial" w:hAnsi="Arial"/>
+                <w:sz w:val="19"/>
+                <w:szCs w:val="19"/>
+              </w:rPr>
+              <w:t>MinVu</w:t>
+            </w:r>
+          </w:p>
+        </w:tc>
+        <w:tc>
+          <w:tcPr>
+            <w:tcW w:type="dxa" w:w="1400"/>
+            <w:tcBorders>
+              <w:top w:val="single" w:color="808080" w:sz="4"/>
+              <w:left w:val="single" w:color="808080" w:sz="4"/>
+              <w:bottom w:val="single" w:color="808080" w:sz="4"/>
+              <w:right w:val="single" w:color="808080" w:sz="4"/>
+            </w:tcBorders>
+            <w:tcMar>
+              <w:top w:type="dxa" w:w="40"/>
+              <w:left w:type="dxa" w:w="90"/>
+              <w:bottom w:type="dxa" w:w="40"/>
+              <w:right w:type="dxa" w:w="90"/>
+            </w:tcMar>
+          </w:tcPr>
+          <w:p>
+            <w:pPr>
+              <w:spacing w:after="30" w:before="30"/>
+            </w:pPr>
+            <w:r>
+              <w:rPr>
+                <w:rFonts w:ascii="Arial" w:cs="Arial" w:eastAsia="Arial" w:hAnsi="Arial"/>
+                <w:b/>
+                <w:bCs/>
+                <w:color w:val="C00000"/>
+                <w:sz w:val="19"/>
+                <w:szCs w:val="19"/>
+              </w:rPr>
+              <w:t>Sin ticket</w:t>
+            </w:r>
+          </w:p>
+        </w:tc>
+        <w:tc>
+          <w:tcPr>
+            <w:tcW w:type="dxa" w:w="4238"/>
+            <w:tcBorders>
+              <w:top w:val="single" w:color="808080" w:sz="4"/>
+              <w:left w:val="single" w:color="808080" w:sz="4"/>
+              <w:bottom w:val="single" w:color="808080" w:sz="4"/>
+              <w:right w:val="single" w:color="808080" w:sz="4"/>
+            </w:tcBorders>
+            <w:tcMar>
+              <w:top w:type="dxa" w:w="40"/>
+              <w:left w:type="dxa" w:w="90"/>
+              <w:bottom w:type="dxa" w:w="40"/>
+              <w:right w:type="dxa" w:w="90"/>
+            </w:tcMar>
+          </w:tcPr>
+          <w:p>
+            <w:pPr>
+              <w:spacing w:after="30" w:before="30"/>
+            </w:pPr>
+            <w:r>
+              <w:rPr>
+                <w:rFonts w:ascii="Arial" w:cs="Arial" w:eastAsia="Arial" w:hAnsi="Arial"/>
+                <w:b/>
+                <w:bCs/>
+                <w:color w:val="C00000"/>
+                <w:sz w:val="19"/>
+                <w:szCs w:val="19"/>
+              </w:rPr>
+              <w:t>Registros Técnicos (RRTT), Alexis Carnero: integración PPTT-RRTT, con la corrección del error de ingreso de solicitudes de Contratistas y Consultores (el repositorio Azure de la API estaba desactualizado respecto del binario en servicio), su verificación en Test y la entrega del listado de componentes y scripts del Hito 3 / Sprint 11</w:t>
+            </w:r>
+          </w:p>
+        </w:tc>
+        <w:tc>
+          <w:tcPr>
+            <w:tcW w:type="dxa" w:w="1300"/>
+            <w:tcBorders>
+              <w:top w:val="single" w:color="808080" w:sz="4"/>
+              <w:left w:val="single" w:color="808080" w:sz="4"/>
+              <w:bottom w:val="single" w:color="808080" w:sz="4"/>
+              <w:right w:val="single" w:color="808080" w:sz="4"/>
+            </w:tcBorders>
+            <w:tcMar>
+              <w:top w:type="dxa" w:w="40"/>
+              <w:left w:type="dxa" w:w="90"/>
+              <w:bottom w:type="dxa" w:w="40"/>
+              <w:right w:type="dxa" w:w="90"/>
+            </w:tcMar>
+          </w:tcPr>
+          <w:p>
+            <w:pPr>
+              <w:spacing w:after="30" w:before="30"/>
+            </w:pPr>
+            <w:r>
+              <w:rPr>
+                <w:rFonts w:ascii="Arial" w:cs="Arial" w:eastAsia="Arial" w:hAnsi="Arial"/>
+                <w:sz w:val="19"/>
+                <w:szCs w:val="19"/>
+              </w:rPr>
+              <w:t>Terminado</w:t>
+            </w:r>
+          </w:p>
+        </w:tc>
+        <w:tc>
+          <w:tcPr>
+            <w:tcW w:type="dxa" w:w="1200"/>
+            <w:tcBorders>
+              <w:top w:val="single" w:color="808080" w:sz="4"/>
+              <w:left w:val="single" w:color="808080" w:sz="4"/>
+              <w:bottom w:val="single" w:color="808080" w:sz="4"/>
+              <w:right w:val="single" w:color="808080" w:sz="4"/>
+            </w:tcBorders>
+            <w:tcMar>
+              <w:top w:type="dxa" w:w="40"/>
+              <w:left w:type="dxa" w:w="90"/>
+              <w:bottom w:type="dxa" w:w="40"/>
+              <w:right w:type="dxa" w:w="90"/>
+            </w:tcMar>
+          </w:tcPr>
+          <w:p>
+            <w:pPr>
+              <w:spacing w:after="30" w:before="30"/>
+            </w:pPr>
+            <w:r>
+              <w:rPr>
+                <w:rFonts w:ascii="Arial" w:cs="Arial" w:eastAsia="Arial" w:hAnsi="Arial"/>
+                <w:sz w:val="19"/>
+                <w:szCs w:val="19"/>
+              </w:rPr>
+              <w:t>8,5</w:t>
+            </w:r>
+          </w:p>
+        </w:tc>
+      </w:tr>
+      <w:tr>
+        <w:trPr>
+          <w:cantSplit/>
+        </w:trPr>
+        <w:tc>
+          <w:tcPr>
+            <w:tcW w:type="dxa" w:w="1500"/>
+            <w:tcBorders>
+              <w:top w:val="single" w:color="808080" w:sz="4"/>
+              <w:left w:val="single" w:color="808080" w:sz="4"/>
+              <w:bottom w:val="single" w:color="808080" w:sz="4"/>
+              <w:right w:val="single" w:color="808080" w:sz="4"/>
+            </w:tcBorders>
+            <w:tcMar>
+              <w:top w:type="dxa" w:w="40"/>
+              <w:left w:type="dxa" w:w="90"/>
+              <w:bottom w:type="dxa" w:w="40"/>
+              <w:right w:type="dxa" w:w="90"/>
+            </w:tcMar>
+          </w:tcPr>
+          <w:p>
+            <w:pPr>
+              <w:spacing w:after="30" w:before="30"/>
+            </w:pPr>
+            <w:r>
+              <w:rPr>
+                <w:rFonts w:ascii="Arial" w:cs="Arial" w:eastAsia="Arial" w:hAnsi="Arial"/>
+                <w:sz w:val="19"/>
+                <w:szCs w:val="19"/>
+              </w:rPr>
+              <w:t>MinVu</w:t>
+            </w:r>
+          </w:p>
+        </w:tc>
+        <w:tc>
+          <w:tcPr>
+            <w:tcW w:type="dxa" w:w="1400"/>
+            <w:tcBorders>
+              <w:top w:val="single" w:color="808080" w:sz="4"/>
+              <w:left w:val="single" w:color="808080" w:sz="4"/>
+              <w:bottom w:val="single" w:color="808080" w:sz="4"/>
+              <w:right w:val="single" w:color="808080" w:sz="4"/>
+            </w:tcBorders>
+            <w:tcMar>
+              <w:top w:type="dxa" w:w="40"/>
+              <w:left w:type="dxa" w:w="90"/>
+              <w:bottom w:type="dxa" w:w="40"/>
+              <w:right w:type="dxa" w:w="90"/>
+            </w:tcMar>
+          </w:tcPr>
+          <w:p>
+            <w:pPr>
+              <w:spacing w:after="30" w:before="30"/>
+            </w:pPr>
+            <w:r>
+              <w:rPr>
+                <w:rFonts w:ascii="Arial" w:cs="Arial" w:eastAsia="Arial" w:hAnsi="Arial"/>
+                <w:b/>
+                <w:bCs/>
+                <w:color w:val="C00000"/>
+                <w:sz w:val="19"/>
+                <w:szCs w:val="19"/>
+              </w:rPr>
+              <w:t>Sin ticket</w:t>
+            </w:r>
+          </w:p>
+        </w:tc>
+        <w:tc>
+          <w:tcPr>
+            <w:tcW w:type="dxa" w:w="4238"/>
+            <w:tcBorders>
+              <w:top w:val="single" w:color="808080" w:sz="4"/>
+              <w:left w:val="single" w:color="808080" w:sz="4"/>
+              <w:bottom w:val="single" w:color="808080" w:sz="4"/>
+              <w:right w:val="single" w:color="808080" w:sz="4"/>
+            </w:tcBorders>
+            <w:tcMar>
+              <w:top w:type="dxa" w:w="40"/>
+              <w:left w:type="dxa" w:w="90"/>
+              <w:bottom w:type="dxa" w:w="40"/>
+              <w:right w:type="dxa" w:w="90"/>
+            </w:tcMar>
+          </w:tcPr>
+          <w:p>
+            <w:pPr>
+              <w:spacing w:after="30" w:before="30"/>
+            </w:pPr>
+            <w:r>
+              <w:rPr>
+                <w:rFonts w:ascii="Arial" w:cs="Arial" w:eastAsia="Arial" w:hAnsi="Arial"/>
+                <w:b/>
+                <w:bCs/>
+                <w:color w:val="C00000"/>
+                <w:sz w:val="19"/>
+                <w:szCs w:val="19"/>
+              </w:rPr>
+              <w:t>Registros Técnicos (RRTT), Alexis Carnero: toma de razón del decreto que modifica el Registro Nacional y selector Antiguo/Actual D.S. N°135 de los buscadores de inscritos; API SyncDocumental (GesDoc) y revisión del informe de QA</w:t>
+            </w:r>
+          </w:p>
+        </w:tc>
+        <w:tc>
+          <w:tcPr>
+            <w:tcW w:type="dxa" w:w="1300"/>
+            <w:tcBorders>
+              <w:top w:val="single" w:color="808080" w:sz="4"/>
+              <w:left w:val="single" w:color="808080" w:sz="4"/>
+              <w:bottom w:val="single" w:color="808080" w:sz="4"/>
+              <w:right w:val="single" w:color="808080" w:sz="4"/>
+            </w:tcBorders>
+            <w:tcMar>
+              <w:top w:type="dxa" w:w="40"/>
+              <w:left w:type="dxa" w:w="90"/>
+              <w:bottom w:type="dxa" w:w="40"/>
+              <w:right w:type="dxa" w:w="90"/>
+            </w:tcMar>
+          </w:tcPr>
+          <w:p>
+            <w:pPr>
+              <w:spacing w:after="30" w:before="30"/>
+            </w:pPr>
+            <w:r>
+              <w:rPr>
+                <w:rFonts w:ascii="Arial" w:cs="Arial" w:eastAsia="Arial" w:hAnsi="Arial"/>
+                <w:sz w:val="19"/>
+                <w:szCs w:val="19"/>
+              </w:rPr>
+              <w:t>Terminado</w:t>
+            </w:r>
+          </w:p>
+        </w:tc>
+        <w:tc>
+          <w:tcPr>
+            <w:tcW w:type="dxa" w:w="1200"/>
+            <w:tcBorders>
+              <w:top w:val="single" w:color="808080" w:sz="4"/>
+              <w:left w:val="single" w:color="808080" w:sz="4"/>
+              <w:bottom w:val="single" w:color="808080" w:sz="4"/>
+              <w:right w:val="single" w:color="808080" w:sz="4"/>
+            </w:tcBorders>
+            <w:tcMar>
+              <w:top w:type="dxa" w:w="40"/>
+              <w:left w:type="dxa" w:w="90"/>
+              <w:bottom w:type="dxa" w:w="40"/>
+              <w:right w:type="dxa" w:w="90"/>
+            </w:tcMar>
+          </w:tcPr>
+          <w:p>
+            <w:pPr>
+              <w:spacing w:after="30" w:before="30"/>
+            </w:pPr>
+            <w:r>
+              <w:rPr>
+                <w:rFonts w:ascii="Arial" w:cs="Arial" w:eastAsia="Arial" w:hAnsi="Arial"/>
+                <w:sz w:val="19"/>
+                <w:szCs w:val="19"/>
+              </w:rPr>
+              <w:t>7,0</w:t>
             </w:r>
           </w:p>
         </w:tc>
@@ -6478,7 +7122,7 @@
               <w:br/>
               <w:t>Fin de semana: domingo 02/08, 2 h de Alexis Carnero. Cruce de medianoche: Franco Dodera, 07/08 de 23:00 a 02:00.</w:t>
               <w:br/>
-              <w:t>Explicación de KLG: Explicación de KLG: las alertas se originan en que 91,0 de las 150,0 h atribuidas a Alexis Carnero eran en realidad de Gabriel Denis, que trabajó sin usuario de Kimai. Separadas en este anexo, Alexis Carnero queda con 59,0 h en 17 días (promedio 3,5 h por día) y Gabriel Denis con 91,0 h en 16 días (promedio 5,7 h por día), y ningún día de ninguno de los dos supera las 9 h: la alerta de «más de 9 h en el día» del 04, 05, 06, 10, 11, 13 y 14/08 deja de corresponder. El domingo 02/08 (2 h) también era de Gabriel Denis y queda a su nombre. El cruce de medianoche del 07/08 de Franco Dodera (23:00 a 02:00) es real: fueron reuniones y revisiones que terminaron pasada la medianoche y Kimai las registró como un único bloque. Sobre «sin ticket»: en agosto los trabajos de SELICO, VictoriusCP2 y Victorius 3 no se venían gestionando con tickets de iTop; desde septiembre toda carga en Kimai empieza con el ticket de iTop o la tarea de ClickUp. Las 59,0 h de Alexis Carnero siguen sin descripción en Kimai: KLG las está reconstruyendo con él y las enviará como corrección de este anexo. Aclaración sobre los horarios: el inicio y el fin de los días compartidos entre Alexis Carnero y Gabriel Denis son una reconstrucción de KLG, no un registro de Kimai. Kimai guardó un único bloque continuo por día a nombre de Alexis, y KLG lo partió por horario asignando el principio del bloque a Alexis y el final a Gabriel (por ejemplo el 04/08: bloque de 08:15 a 23:15, Alexis de 08:15 a 15:15 y Gabriel de 15:15 a 23:15). Las horas de cada uno sí están respaldadas: las de Gabriel salen de su reporte diario de agosto. Cada fila afectada del Anexo II-A lo indica en la columna «Nota KLG».</w:t>
+              <w:t>Explicación de KLG: Explicación de KLG: las alertas se originan en que 91,0 de las 150,0 h atribuidas a Alexis Carnero eran en realidad de Gabriel Denis, que trabajó sin usuario de Kimai. Separadas en este anexo, Alexis Carnero queda con 59,0 h en 17 días (promedio 3,5 h por día) y Gabriel Denis con 91,0 h en 16 días (promedio 5,7 h por día), y ningún día de ninguno de los dos supera las 9 h: la alerta de «más de 9 h en el día» del 04, 05, 06, 10, 11, 13 y 14/08 deja de corresponder. El domingo 02/08 (2 h) también era de Gabriel Denis y queda a su nombre. El cruce de medianoche del 07/08 de Franco Dodera (23:00 a 02:00) es real: fueron reuniones y revisiones que terminaron pasada la medianoche y Kimai las registró como un único bloque. Sobre «sin ticket»: en agosto los trabajos de SELICO, VictoriusCP2 y Victorius 3 no se venían gestionando con tickets de iTop; desde septiembre toda carga en Kimai empieza con el ticket de iTop o la tarea de ClickUp. Alexis Carnero entregó su detalle diario de agosto: está incorporado al Anexo II-A, donde sus 59,0 h quedan descritas registro por registro, y coincide con la separación de horas de este anexo, los mismos 17 días con el mismo inicio, el mismo fin y las mismas horas. Aclaración sobre los horarios: el inicio y el fin de los días compartidos entre Alexis Carnero y Gabriel Denis son una reconstrucción de KLG, no un registro de Kimai. Kimai guardó un único bloque continuo por día a nombre de Alexis, y KLG lo partió por horario asignando el principio del bloque a Alexis y el final a Gabriel (por ejemplo el 04/08: bloque de 08:15 a 23:15, Alexis de 08:15 a 15:15 y Gabriel de 15:15 a 23:15). Las horas de cada uno sí están respaldadas: las de Gabriel salen de su reporte diario de agosto. Cada fila afectada del Anexo II-A lo indica en la columna «Nota KLG».</w:t>
             </w:r>
           </w:p>
         </w:tc>

</xml_diff>